<commit_message>
docs: add appendix figures A1–A10 to List of Figures when generating report DOCX
Made-with: Cursor
</commit_message>
<xml_diff>
--- a/docs/Syed_Abbas_Raza_Project_Report_With_Screenshots.docx
+++ b/docs/Syed_Abbas_Raza_Project_Report_With_Screenshots.docx
@@ -1994,6 +1994,306 @@
               </w:rPr>
               <w:t>31</w:t>
             </w:r>
+          </w:p>
+        </w:tc>
+      </w:tr>
+      <w:tr>
+        <w:tc>
+          <w:tcPr>
+            <w:tcW w:type="dxa" w:w="2880"/>
+          </w:tcPr>
+          <w:p>
+            <w:r>
+              <w:t>A1</w:t>
+            </w:r>
+          </w:p>
+        </w:tc>
+        <w:tc>
+          <w:tcPr>
+            <w:tcW w:type="dxa" w:w="2880"/>
+          </w:tcPr>
+          <w:p>
+            <w:r>
+              <w:t>GET /api/products/ — product list</w:t>
+            </w:r>
+          </w:p>
+        </w:tc>
+        <w:tc>
+          <w:tcPr>
+            <w:tcW w:type="dxa" w:w="2880"/>
+          </w:tcPr>
+          <w:p>
+            <w:r/>
+          </w:p>
+        </w:tc>
+      </w:tr>
+      <w:tr>
+        <w:tc>
+          <w:tcPr>
+            <w:tcW w:type="dxa" w:w="2880"/>
+          </w:tcPr>
+          <w:p>
+            <w:r>
+              <w:t>A2</w:t>
+            </w:r>
+          </w:p>
+        </w:tc>
+        <w:tc>
+          <w:tcPr>
+            <w:tcW w:type="dxa" w:w="2880"/>
+          </w:tcPr>
+          <w:p>
+            <w:r>
+              <w:t>GET /api/products/filter/ — price range filter</w:t>
+            </w:r>
+          </w:p>
+        </w:tc>
+        <w:tc>
+          <w:tcPr>
+            <w:tcW w:type="dxa" w:w="2880"/>
+          </w:tcPr>
+          <w:p>
+            <w:r/>
+          </w:p>
+        </w:tc>
+      </w:tr>
+      <w:tr>
+        <w:tc>
+          <w:tcPr>
+            <w:tcW w:type="dxa" w:w="2880"/>
+          </w:tcPr>
+          <w:p>
+            <w:r>
+              <w:t>A3</w:t>
+            </w:r>
+          </w:p>
+        </w:tc>
+        <w:tc>
+          <w:tcPr>
+            <w:tcW w:type="dxa" w:w="2880"/>
+          </w:tcPr>
+          <w:p>
+            <w:r>
+              <w:t>Django administration — login.</w:t>
+            </w:r>
+          </w:p>
+        </w:tc>
+        <w:tc>
+          <w:tcPr>
+            <w:tcW w:type="dxa" w:w="2880"/>
+          </w:tcPr>
+          <w:p>
+            <w:r/>
+          </w:p>
+        </w:tc>
+      </w:tr>
+      <w:tr>
+        <w:tc>
+          <w:tcPr>
+            <w:tcW w:type="dxa" w:w="2880"/>
+          </w:tcPr>
+          <w:p>
+            <w:r>
+              <w:t>A4</w:t>
+            </w:r>
+          </w:p>
+        </w:tc>
+        <w:tc>
+          <w:tcPr>
+            <w:tcW w:type="dxa" w:w="2880"/>
+          </w:tcPr>
+          <w:p>
+            <w:r>
+              <w:t>Django administration — registered models</w:t>
+            </w:r>
+          </w:p>
+        </w:tc>
+        <w:tc>
+          <w:tcPr>
+            <w:tcW w:type="dxa" w:w="2880"/>
+          </w:tcPr>
+          <w:p>
+            <w:r/>
+          </w:p>
+        </w:tc>
+      </w:tr>
+      <w:tr>
+        <w:tc>
+          <w:tcPr>
+            <w:tcW w:type="dxa" w:w="2880"/>
+          </w:tcPr>
+          <w:p>
+            <w:r>
+              <w:t>A5</w:t>
+            </w:r>
+          </w:p>
+        </w:tc>
+        <w:tc>
+          <w:tcPr>
+            <w:tcW w:type="dxa" w:w="2880"/>
+          </w:tcPr>
+          <w:p>
+            <w:r>
+              <w:t>GET /api/products/1/stock/ — stock check</w:t>
+            </w:r>
+          </w:p>
+        </w:tc>
+        <w:tc>
+          <w:tcPr>
+            <w:tcW w:type="dxa" w:w="2880"/>
+          </w:tcPr>
+          <w:p>
+            <w:r/>
+          </w:p>
+        </w:tc>
+      </w:tr>
+      <w:tr>
+        <w:tc>
+          <w:tcPr>
+            <w:tcW w:type="dxa" w:w="2880"/>
+          </w:tcPr>
+          <w:p>
+            <w:r>
+              <w:t>A6</w:t>
+            </w:r>
+          </w:p>
+        </w:tc>
+        <w:tc>
+          <w:tcPr>
+            <w:tcW w:type="dxa" w:w="2880"/>
+          </w:tcPr>
+          <w:p>
+            <w:r>
+              <w:t>GET /api/payments/ — payment list with idempotency &amp; webhook fields</w:t>
+            </w:r>
+          </w:p>
+        </w:tc>
+        <w:tc>
+          <w:tcPr>
+            <w:tcW w:type="dxa" w:w="2880"/>
+          </w:tcPr>
+          <w:p>
+            <w:r/>
+          </w:p>
+        </w:tc>
+      </w:tr>
+      <w:tr>
+        <w:tc>
+          <w:tcPr>
+            <w:tcW w:type="dxa" w:w="2880"/>
+          </w:tcPr>
+          <w:p>
+            <w:r>
+              <w:t>A7</w:t>
+            </w:r>
+          </w:p>
+        </w:tc>
+        <w:tc>
+          <w:tcPr>
+            <w:tcW w:type="dxa" w:w="2880"/>
+          </w:tcPr>
+          <w:p>
+            <w:r>
+              <w:t>GET /api/products/health/ — health check</w:t>
+            </w:r>
+          </w:p>
+        </w:tc>
+        <w:tc>
+          <w:tcPr>
+            <w:tcW w:type="dxa" w:w="2880"/>
+          </w:tcPr>
+          <w:p>
+            <w:r/>
+          </w:p>
+        </w:tc>
+      </w:tr>
+      <w:tr>
+        <w:tc>
+          <w:tcPr>
+            <w:tcW w:type="dxa" w:w="2880"/>
+          </w:tcPr>
+          <w:p>
+            <w:r>
+              <w:t>A8</w:t>
+            </w:r>
+          </w:p>
+        </w:tc>
+        <w:tc>
+          <w:tcPr>
+            <w:tcW w:type="dxa" w:w="2880"/>
+          </w:tcPr>
+          <w:p>
+            <w:r>
+              <w:t>GET /api/products/search/ returns 405 — search endpoint is POST-only</w:t>
+            </w:r>
+          </w:p>
+        </w:tc>
+        <w:tc>
+          <w:tcPr>
+            <w:tcW w:type="dxa" w:w="2880"/>
+          </w:tcPr>
+          <w:p>
+            <w:r/>
+          </w:p>
+        </w:tc>
+      </w:tr>
+      <w:tr>
+        <w:tc>
+          <w:tcPr>
+            <w:tcW w:type="dxa" w:w="2880"/>
+          </w:tcPr>
+          <w:p>
+            <w:r>
+              <w:t>A9</w:t>
+            </w:r>
+          </w:p>
+        </w:tc>
+        <w:tc>
+          <w:tcPr>
+            <w:tcW w:type="dxa" w:w="2880"/>
+          </w:tcPr>
+          <w:p>
+            <w:r>
+              <w:t>POST /api/products/search/ — pagination &amp; search results</w:t>
+            </w:r>
+          </w:p>
+        </w:tc>
+        <w:tc>
+          <w:tcPr>
+            <w:tcW w:type="dxa" w:w="2880"/>
+          </w:tcPr>
+          <w:p>
+            <w:r/>
+          </w:p>
+        </w:tc>
+      </w:tr>
+      <w:tr>
+        <w:tc>
+          <w:tcPr>
+            <w:tcW w:type="dxa" w:w="2880"/>
+          </w:tcPr>
+          <w:p>
+            <w:r>
+              <w:t>A10</w:t>
+            </w:r>
+          </w:p>
+        </w:tc>
+        <w:tc>
+          <w:tcPr>
+            <w:tcW w:type="dxa" w:w="2880"/>
+          </w:tcPr>
+          <w:p>
+            <w:r>
+              <w:t>GET /api/products/1/ — product detail with Redis caching</w:t>
+            </w:r>
+          </w:p>
+        </w:tc>
+        <w:tc>
+          <w:tcPr>
+            <w:tcW w:type="dxa" w:w="2880"/>
+          </w:tcPr>
+          <w:p>
+            <w:r/>
           </w:p>
         </w:tc>
       </w:tr>

</xml_diff>